<commit_message>
Update roadmap doc: Taylor Stewart LLC, remove page breaks
Co-Authored-By: Claude Opus 4.6 <noreply@anthropic.com>
</commit_message>
<xml_diff>
--- a/TaskQ_iOS_Roadmap.docx
+++ b/TaskQ_iOS_Roadmap.docx
@@ -69,7 +69,7 @@
           <w:sz w:val="22"/>
           <w:szCs w:val="22"/>
         </w:rPr>
-        <w:t xml:space="preserve">Prepared for Qponent, Inc.</w:t>
+        <w:t xml:space="preserve">Prepared for Taylor Stewart LLC</w:t>
       </w:r>
     </w:p>
     <w:p>
@@ -327,9 +327,9 @@
       </w:r>
     </w:p>
     <w:p>
-      <w:r>
-        <w:br w:type="page"/>
-      </w:r>
+      <w:pPr>
+        <w:spacing w:before="240"/>
+      </w:pPr>
     </w:p>
     <w:p>
       <w:pPr>
@@ -1302,9 +1302,9 @@
       </w:tr>
     </w:tbl>
     <w:p>
-      <w:r>
-        <w:br w:type="page"/>
-      </w:r>
+      <w:pPr>
+        <w:spacing w:before="240"/>
+      </w:pPr>
     </w:p>
     <w:p>
       <w:pPr>
@@ -2277,9 +2277,9 @@
       </w:tr>
     </w:tbl>
     <w:p>
-      <w:r>
-        <w:br w:type="page"/>
-      </w:r>
+      <w:pPr>
+        <w:spacing w:before="240"/>
+      </w:pPr>
     </w:p>
     <w:p>
       <w:pPr>
@@ -3347,9 +3347,9 @@
       </w:tr>
     </w:tbl>
     <w:p>
-      <w:r>
-        <w:br w:type="page"/>
-      </w:r>
+      <w:pPr>
+        <w:spacing w:before="240"/>
+      </w:pPr>
     </w:p>
     <w:p>
       <w:pPr>
@@ -4004,7 +4004,7 @@
           <w:sz w:val="18"/>
           <w:szCs w:val="18"/>
         </w:rPr>
-        <w:t xml:space="preserve">Document prepared by Claude for Trevor Coddington / Qponent, Inc.</w:t>
+        <w:t xml:space="preserve">Document prepared by Claude for Trevor Coddington / Taylor Stewart LLC</w:t>
       </w:r>
     </w:p>
     <w:sectPr>

</xml_diff>